<commit_message>
Daily and Weekly update
</commit_message>
<xml_diff>
--- a/Articles/2026/3_DaVinci_Tips_and_Tricks/11_Fix_Slow_Clips_Render_in_Place/Write Up.docx
+++ b/Articles/2026/3_DaVinci_Tips_and_Tricks/11_Fix_Slow_Clips_Render_in_Place/Write Up.docx
@@ -12,27 +12,54 @@
     </w:p>
     <w:p>
       <w:r>
-        <w:t>If your clip is running slow or your timeline feels overloaded, this quick tutorial shows how Render in Place can turn a heavy clip into smooth, stress</w:t>
-      </w:r>
-      <w:r>
-        <w:noBreakHyphen/>
-        <w:t>free playback.</w:t>
+        <w:t>If your clip has grown to include several effects and transitions, you might find that the animation has slowed to a crawl. This is not good for a good video creation at all.</w:t>
       </w:r>
     </w:p>
     <w:p>
       <w:r>
-        <w:t>So, if you have ever been frustrated with DaVinci for Misbehaving like this, then please join us for our brand-new tutorial entitled:</w:t>
+        <w:t xml:space="preserve">So, </w:t>
+      </w:r>
+      <w:r>
+        <w:t>if you ever find yourself in the slow lane when you play back your project</w:t>
+      </w:r>
+      <w:r>
+        <w:t>, then please join us for our brand-new tutorial entitled:</w:t>
       </w:r>
     </w:p>
     <w:p>
       <w:pPr>
-        <w:pStyle w:val="Heading1"/>
+        <w:rPr>
+          <w:rFonts w:asciiTheme="majorHAnsi" w:eastAsiaTheme="majorEastAsia" w:hAnsiTheme="majorHAnsi" w:cstheme="majorBidi"/>
+          <w:b/>
+          <w:bCs/>
+          <w:color w:val="2F5496" w:themeColor="accent1" w:themeShade="BF"/>
+          <w:sz w:val="28"/>
+          <w:szCs w:val="28"/>
+        </w:rPr>
       </w:pPr>
       <w:r>
-        <w:t>10 How to Change Clip Speed and Duration in DaVinci Resolve</w:t>
+        <w:rPr>
+          <w:rFonts w:asciiTheme="majorHAnsi" w:eastAsiaTheme="majorEastAsia" w:hAnsiTheme="majorHAnsi" w:cstheme="majorBidi"/>
+          <w:b/>
+          <w:bCs/>
+          <w:color w:val="2F5496" w:themeColor="accent1" w:themeShade="BF"/>
+          <w:sz w:val="28"/>
+          <w:szCs w:val="28"/>
+        </w:rPr>
+        <w:t xml:space="preserve">11 How to Fix Slow or Choppy Clips in DaVinci Resolve </w:t>
       </w:r>
     </w:p>
-    <w:p/>
+    <w:p>
+      <w:pPr>
+        <w:pStyle w:val="Subtitle"/>
+      </w:pPr>
+      <w:r>
+        <w:rPr>
+          <w:rFonts w:eastAsiaTheme="majorEastAsia"/>
+        </w:rPr>
+        <w:t>Using Render in Place</w:t>
+      </w:r>
+    </w:p>
     <w:p>
       <w:pPr>
         <w:pStyle w:val="Heading1"/>

</xml_diff>